<commit_message>
allow for multiple db and cohorts in descriptions tabs
</commit_message>
<xml_diff>
--- a/inst/shiny/data/raw/clinical_descriptions/template/template.docx
+++ b/inst/shiny/data/raw/clinical_descriptions/template/template.docx
@@ -83,9 +83,13 @@
           <w:szCs w:val="18"/>
           <w:lang w:eastAsia="en-GB"/>
         </w:rPr>
-        <w:t>Author:</w:t>
+        <w:t xml:space="preserve">Author: </w:t>
       </w:r>
-      <w:r>
+    </w:p>
+    <w:p>
+      <w:pPr>
+        <w:spacing w:after="240" w:line="240" w:lineRule="auto"/>
+        <w:outlineLvl w:val="1"/>
         <w:rPr>
           <w:rFonts w:ascii="Segoe UI" w:eastAsia="Times New Roman" w:hAnsi="Segoe UI" w:cs="Segoe UI"/>
           <w:b/>
@@ -94,45 +98,17 @@
           <w:szCs w:val="18"/>
           <w:lang w:eastAsia="en-GB"/>
         </w:rPr>
-        <w:t xml:space="preserve"> </w:t>
-      </w:r>
-    </w:p>
-    <w:p>
-      <w:pPr>
-        <w:spacing w:after="240" w:line="240" w:lineRule="auto"/>
-        <w:outlineLvl w:val="1"/>
+      </w:pPr>
+      <w:r>
         <w:rPr>
           <w:rFonts w:ascii="Segoe UI" w:eastAsia="Times New Roman" w:hAnsi="Segoe UI" w:cs="Segoe UI"/>
           <w:b/>
           <w:bCs/>
           <w:sz w:val="18"/>
           <w:szCs w:val="18"/>
-          <w:lang w:val="fr-FR" w:eastAsia="en-GB"/>
-        </w:rPr>
-      </w:pPr>
-      <w:proofErr w:type="gramStart"/>
-      <w:r>
-        <w:rPr>
-          <w:rFonts w:ascii="Segoe UI" w:eastAsia="Times New Roman" w:hAnsi="Segoe UI" w:cs="Segoe UI"/>
-          <w:b/>
-          <w:bCs/>
-          <w:sz w:val="18"/>
-          <w:szCs w:val="18"/>
-          <w:lang w:val="fr-FR" w:eastAsia="en-GB"/>
-        </w:rPr>
-        <w:t>Date:</w:t>
-      </w:r>
-      <w:proofErr w:type="gramEnd"/>
-      <w:r>
-        <w:rPr>
-          <w:rFonts w:ascii="Segoe UI" w:eastAsia="Times New Roman" w:hAnsi="Segoe UI" w:cs="Segoe UI"/>
-          <w:b/>
-          <w:bCs/>
-          <w:sz w:val="18"/>
-          <w:szCs w:val="18"/>
-          <w:lang w:val="fr-FR" w:eastAsia="en-GB"/>
-        </w:rPr>
-        <w:t xml:space="preserve"> </w:t>
+          <w:lang w:eastAsia="en-GB"/>
+        </w:rPr>
+        <w:t xml:space="preserve">Date: </w:t>
       </w:r>
     </w:p>
     <w:p>
@@ -145,7 +121,7 @@
           <w:bCs/>
           <w:sz w:val="30"/>
           <w:szCs w:val="30"/>
-          <w:lang w:val="fr-FR" w:eastAsia="en-GB"/>
+          <w:lang w:eastAsia="en-GB"/>
         </w:rPr>
       </w:pPr>
       <w:r>
@@ -155,9 +131,22 @@
           <w:bCs/>
           <w:sz w:val="30"/>
           <w:szCs w:val="30"/>
-          <w:lang w:val="fr-FR" w:eastAsia="en-GB"/>
+          <w:lang w:eastAsia="en-GB"/>
         </w:rPr>
         <w:t>Information source</w:t>
+      </w:r>
+    </w:p>
+    <w:p>
+      <w:pPr>
+        <w:rPr>
+          <w:lang w:eastAsia="en-GB"/>
+        </w:rPr>
+      </w:pPr>
+      <w:r>
+        <w:rPr>
+          <w:lang w:eastAsia="en-GB"/>
+        </w:rPr>
+        <w:t>[Insert here the sources]</w:t>
       </w:r>
     </w:p>
     <w:p>
@@ -170,7 +159,7 @@
           <w:bCs/>
           <w:sz w:val="30"/>
           <w:szCs w:val="30"/>
-          <w:lang w:val="fr-FR" w:eastAsia="en-GB"/>
+          <w:lang w:eastAsia="en-GB"/>
         </w:rPr>
       </w:pPr>
       <w:r>
@@ -180,9 +169,34 @@
           <w:bCs/>
           <w:sz w:val="30"/>
           <w:szCs w:val="30"/>
-          <w:lang w:val="fr-FR" w:eastAsia="en-GB"/>
+          <w:lang w:eastAsia="en-GB"/>
         </w:rPr>
         <w:t>Introduction</w:t>
+      </w:r>
+    </w:p>
+    <w:p>
+      <w:pPr>
+        <w:rPr>
+          <w:lang w:eastAsia="en-GB"/>
+        </w:rPr>
+      </w:pPr>
+      <w:r>
+        <w:rPr>
+          <w:lang w:eastAsia="en-GB"/>
+        </w:rPr>
+        <w:t xml:space="preserve">[Insert here the </w:t>
+      </w:r>
+      <w:r>
+        <w:rPr>
+          <w:lang w:eastAsia="en-GB"/>
+        </w:rPr>
+        <w:t>clinical descriptions</w:t>
+      </w:r>
+      <w:r>
+        <w:rPr>
+          <w:lang w:eastAsia="en-GB"/>
+        </w:rPr>
+        <w:t>]</w:t>
       </w:r>
     </w:p>
     <w:p>
@@ -211,6 +225,38 @@
         </w:rPr>
         <w:lastRenderedPageBreak/>
         <w:t>Phenotyping plan</w:t>
+      </w:r>
+    </w:p>
+    <w:p>
+      <w:pPr>
+        <w:rPr>
+          <w:lang w:eastAsia="en-GB"/>
+        </w:rPr>
+      </w:pPr>
+    </w:p>
+    <w:p>
+      <w:pPr>
+        <w:rPr>
+          <w:lang w:eastAsia="en-GB"/>
+        </w:rPr>
+      </w:pPr>
+      <w:r>
+        <w:rPr>
+          <w:lang w:eastAsia="en-GB"/>
+        </w:rPr>
+        <w:t xml:space="preserve">[Insert here the </w:t>
+      </w:r>
+      <w:r>
+        <w:rPr>
+          <w:lang w:eastAsia="en-GB"/>
+        </w:rPr>
+        <w:t>phenotyping plan</w:t>
+      </w:r>
+      <w:r>
+        <w:rPr>
+          <w:lang w:eastAsia="en-GB"/>
+        </w:rPr>
+        <w:t>]</w:t>
       </w:r>
     </w:p>
     <w:p/>
@@ -1575,12 +1621,65 @@
 </file>
 
 <file path=customXml/item1.xml><?xml version="1.0" encoding="utf-8"?>
-<?mso-contentType ?>
-<FormTemplates xmlns="http://schemas.microsoft.com/sharepoint/v3/contenttype/forms">
-  <Display>DocumentLibraryForm</Display>
-  <Edit>DocumentLibraryForm</Edit>
-  <New>DocumentLibraryForm</New>
-</FormTemplates>
+<p:properties xmlns:p="http://schemas.microsoft.com/office/2006/metadata/properties" xmlns:xsi="http://www.w3.org/2001/XMLSchema-instance" xmlns:pc="http://schemas.microsoft.com/office/infopath/2007/PartnerControls">
+  <documentManagement>
+    <Math_Settings xmlns="3aedf1c0-925e-4524-a733-b26409c497aa" xsi:nil="true"/>
+    <Members xmlns="3aedf1c0-925e-4524-a733-b26409c497aa">
+      <UserInfo>
+        <DisplayName/>
+        <AccountId xsi:nil="true"/>
+        <AccountType/>
+      </UserInfo>
+    </Members>
+    <Self_Registration_Enabled xmlns="3aedf1c0-925e-4524-a733-b26409c497aa" xsi:nil="true"/>
+    <LMS_Mappings xmlns="3aedf1c0-925e-4524-a733-b26409c497aa" xsi:nil="true"/>
+    <TaxCatchAll xmlns="b3804bb9-11fa-4e2e-86f5-8d7bf731dfbd" xsi:nil="true"/>
+    <FolderType xmlns="3aedf1c0-925e-4524-a733-b26409c497aa" xsi:nil="true"/>
+    <AppVersion xmlns="3aedf1c0-925e-4524-a733-b26409c497aa" xsi:nil="true"/>
+    <IsNotebookLocked xmlns="3aedf1c0-925e-4524-a733-b26409c497aa" xsi:nil="true"/>
+    <DefaultSectionNames xmlns="3aedf1c0-925e-4524-a733-b26409c497aa" xsi:nil="true"/>
+    <Templates xmlns="3aedf1c0-925e-4524-a733-b26409c497aa" xsi:nil="true"/>
+    <Has_Leaders_Only_SectionGroup xmlns="3aedf1c0-925e-4524-a733-b26409c497aa" xsi:nil="true"/>
+    <NotebookType xmlns="3aedf1c0-925e-4524-a733-b26409c497aa" xsi:nil="true"/>
+    <lcf76f155ced4ddcb4097134ff3c332f xmlns="3aedf1c0-925e-4524-a733-b26409c497aa">
+      <Terms xmlns="http://schemas.microsoft.com/office/infopath/2007/PartnerControls"/>
+    </lcf76f155ced4ddcb4097134ff3c332f>
+    <Is_Collaboration_Space_Locked xmlns="3aedf1c0-925e-4524-a733-b26409c497aa" xsi:nil="true"/>
+    <Member_Groups xmlns="3aedf1c0-925e-4524-a733-b26409c497aa">
+      <UserInfo>
+        <DisplayName/>
+        <AccountId xsi:nil="true"/>
+        <AccountType/>
+      </UserInfo>
+    </Member_Groups>
+    <Owner xmlns="3aedf1c0-925e-4524-a733-b26409c497aa">
+      <UserInfo>
+        <DisplayName/>
+        <AccountId xsi:nil="true"/>
+        <AccountType/>
+      </UserInfo>
+    </Owner>
+    <Distribution_Groups xmlns="3aedf1c0-925e-4524-a733-b26409c497aa" xsi:nil="true"/>
+    <PersontoInquire xmlns="3aedf1c0-925e-4524-a733-b26409c497aa">
+      <UserInfo>
+        <DisplayName/>
+        <AccountId xsi:nil="true"/>
+        <AccountType/>
+      </UserInfo>
+    </PersontoInquire>
+    <CultureName xmlns="3aedf1c0-925e-4524-a733-b26409c497aa" xsi:nil="true"/>
+    <Leaders xmlns="3aedf1c0-925e-4524-a733-b26409c497aa">
+      <UserInfo>
+        <DisplayName/>
+        <AccountId xsi:nil="true"/>
+        <AccountType/>
+      </UserInfo>
+    </Leaders>
+    <TeamsChannelId xmlns="3aedf1c0-925e-4524-a733-b26409c497aa" xsi:nil="true"/>
+    <Invited_Leaders xmlns="3aedf1c0-925e-4524-a733-b26409c497aa" xsi:nil="true"/>
+    <Invited_Members xmlns="3aedf1c0-925e-4524-a733-b26409c497aa" xsi:nil="true"/>
+  </documentManagement>
+</p:properties>
 </file>
 
 <file path=customXml/item2.xml><?xml version="1.0" encoding="utf-8"?>
@@ -2053,71 +2152,21 @@
 </file>
 
 <file path=customXml/item3.xml><?xml version="1.0" encoding="utf-8"?>
-<p:properties xmlns:p="http://schemas.microsoft.com/office/2006/metadata/properties" xmlns:xsi="http://www.w3.org/2001/XMLSchema-instance" xmlns:pc="http://schemas.microsoft.com/office/infopath/2007/PartnerControls">
-  <documentManagement>
-    <Math_Settings xmlns="3aedf1c0-925e-4524-a733-b26409c497aa" xsi:nil="true"/>
-    <Members xmlns="3aedf1c0-925e-4524-a733-b26409c497aa">
-      <UserInfo>
-        <DisplayName/>
-        <AccountId xsi:nil="true"/>
-        <AccountType/>
-      </UserInfo>
-    </Members>
-    <Self_Registration_Enabled xmlns="3aedf1c0-925e-4524-a733-b26409c497aa" xsi:nil="true"/>
-    <LMS_Mappings xmlns="3aedf1c0-925e-4524-a733-b26409c497aa" xsi:nil="true"/>
-    <TaxCatchAll xmlns="b3804bb9-11fa-4e2e-86f5-8d7bf731dfbd" xsi:nil="true"/>
-    <FolderType xmlns="3aedf1c0-925e-4524-a733-b26409c497aa" xsi:nil="true"/>
-    <AppVersion xmlns="3aedf1c0-925e-4524-a733-b26409c497aa" xsi:nil="true"/>
-    <IsNotebookLocked xmlns="3aedf1c0-925e-4524-a733-b26409c497aa" xsi:nil="true"/>
-    <DefaultSectionNames xmlns="3aedf1c0-925e-4524-a733-b26409c497aa" xsi:nil="true"/>
-    <Templates xmlns="3aedf1c0-925e-4524-a733-b26409c497aa" xsi:nil="true"/>
-    <Has_Leaders_Only_SectionGroup xmlns="3aedf1c0-925e-4524-a733-b26409c497aa" xsi:nil="true"/>
-    <NotebookType xmlns="3aedf1c0-925e-4524-a733-b26409c497aa" xsi:nil="true"/>
-    <lcf76f155ced4ddcb4097134ff3c332f xmlns="3aedf1c0-925e-4524-a733-b26409c497aa">
-      <Terms xmlns="http://schemas.microsoft.com/office/infopath/2007/PartnerControls"/>
-    </lcf76f155ced4ddcb4097134ff3c332f>
-    <Is_Collaboration_Space_Locked xmlns="3aedf1c0-925e-4524-a733-b26409c497aa" xsi:nil="true"/>
-    <Member_Groups xmlns="3aedf1c0-925e-4524-a733-b26409c497aa">
-      <UserInfo>
-        <DisplayName/>
-        <AccountId xsi:nil="true"/>
-        <AccountType/>
-      </UserInfo>
-    </Member_Groups>
-    <Owner xmlns="3aedf1c0-925e-4524-a733-b26409c497aa">
-      <UserInfo>
-        <DisplayName/>
-        <AccountId xsi:nil="true"/>
-        <AccountType/>
-      </UserInfo>
-    </Owner>
-    <Distribution_Groups xmlns="3aedf1c0-925e-4524-a733-b26409c497aa" xsi:nil="true"/>
-    <PersontoInquire xmlns="3aedf1c0-925e-4524-a733-b26409c497aa">
-      <UserInfo>
-        <DisplayName/>
-        <AccountId xsi:nil="true"/>
-        <AccountType/>
-      </UserInfo>
-    </PersontoInquire>
-    <CultureName xmlns="3aedf1c0-925e-4524-a733-b26409c497aa" xsi:nil="true"/>
-    <Leaders xmlns="3aedf1c0-925e-4524-a733-b26409c497aa">
-      <UserInfo>
-        <DisplayName/>
-        <AccountId xsi:nil="true"/>
-        <AccountType/>
-      </UserInfo>
-    </Leaders>
-    <TeamsChannelId xmlns="3aedf1c0-925e-4524-a733-b26409c497aa" xsi:nil="true"/>
-    <Invited_Leaders xmlns="3aedf1c0-925e-4524-a733-b26409c497aa" xsi:nil="true"/>
-    <Invited_Members xmlns="3aedf1c0-925e-4524-a733-b26409c497aa" xsi:nil="true"/>
-  </documentManagement>
-</p:properties>
+<?mso-contentType ?>
+<FormTemplates xmlns="http://schemas.microsoft.com/sharepoint/v3/contenttype/forms">
+  <Display>DocumentLibraryForm</Display>
+  <Edit>DocumentLibraryForm</Edit>
+  <New>DocumentLibraryForm</New>
+</FormTemplates>
 </file>
 
 <file path=customXml/itemProps1.xml><?xml version="1.0" encoding="utf-8"?>
-<ds:datastoreItem xmlns:ds="http://schemas.openxmlformats.org/officeDocument/2006/customXml" ds:itemID="{DC1F5E1F-0057-452C-83F1-21734FEE5FC3}">
+<ds:datastoreItem xmlns:ds="http://schemas.openxmlformats.org/officeDocument/2006/customXml" ds:itemID="{2750510D-F6E9-4EC4-9055-2016929B5183}">
   <ds:schemaRefs>
-    <ds:schemaRef ds:uri="http://schemas.microsoft.com/sharepoint/v3/contenttype/forms"/>
+    <ds:schemaRef ds:uri="http://schemas.microsoft.com/office/2006/metadata/properties"/>
+    <ds:schemaRef ds:uri="http://schemas.microsoft.com/office/infopath/2007/PartnerControls"/>
+    <ds:schemaRef ds:uri="3aedf1c0-925e-4524-a733-b26409c497aa"/>
+    <ds:schemaRef ds:uri="b3804bb9-11fa-4e2e-86f5-8d7bf731dfbd"/>
   </ds:schemaRefs>
 </ds:datastoreItem>
 </file>
@@ -2142,12 +2191,9 @@
 </file>
 
 <file path=customXml/itemProps3.xml><?xml version="1.0" encoding="utf-8"?>
-<ds:datastoreItem xmlns:ds="http://schemas.openxmlformats.org/officeDocument/2006/customXml" ds:itemID="{2750510D-F6E9-4EC4-9055-2016929B5183}">
+<ds:datastoreItem xmlns:ds="http://schemas.openxmlformats.org/officeDocument/2006/customXml" ds:itemID="{DC1F5E1F-0057-452C-83F1-21734FEE5FC3}">
   <ds:schemaRefs>
-    <ds:schemaRef ds:uri="http://schemas.microsoft.com/office/2006/metadata/properties"/>
-    <ds:schemaRef ds:uri="http://schemas.microsoft.com/office/infopath/2007/PartnerControls"/>
-    <ds:schemaRef ds:uri="3aedf1c0-925e-4524-a733-b26409c497aa"/>
-    <ds:schemaRef ds:uri="b3804bb9-11fa-4e2e-86f5-8d7bf731dfbd"/>
+    <ds:schemaRef ds:uri="http://schemas.microsoft.com/sharepoint/v3/contenttype/forms"/>
   </ds:schemaRefs>
 </ds:datastoreItem>
 </file>
</xml_diff>